<commit_message>
Updated home page look
</commit_message>
<xml_diff>
--- a/public/docs/Andrija_Lazic_Resume.docx
+++ b/public/docs/Andrija_Lazic_Resume.docx
@@ -2,6 +2,17 @@
 <file path=word/document.xml><?xml version="1.0" encoding="utf-8"?>
 <w:document xmlns:wpc="http://schemas.microsoft.com/office/word/2010/wordprocessingCanvas" xmlns:cx="http://schemas.microsoft.com/office/drawing/2014/chartex" xmlns:cx1="http://schemas.microsoft.com/office/drawing/2015/9/8/chartex" xmlns:cx2="http://schemas.microsoft.com/office/drawing/2015/10/21/chartex" xmlns:cx3="http://schemas.microsoft.com/office/drawing/2016/5/9/chartex" xmlns:cx4="http://schemas.microsoft.com/office/drawing/2016/5/10/chartex" xmlns:cx5="http://schemas.microsoft.com/office/drawing/2016/5/11/chartex" xmlns:cx6="http://schemas.microsoft.com/office/drawing/2016/5/12/chartex" xmlns:cx7="http://schemas.microsoft.com/office/drawing/2016/5/13/chartex" xmlns:cx8="http://schemas.microsoft.com/office/drawing/2016/5/14/chartex" xmlns:mc="http://schemas.openxmlformats.org/markup-compatibility/2006" xmlns:aink="http://schemas.microsoft.com/office/drawing/2016/ink" xmlns:am3d="http://schemas.microsoft.com/office/drawing/2017/model3d" xmlns:o="urn:schemas-microsoft-com:office:office" xmlns:oel="http://schemas.microsoft.com/office/2019/extlst" xmlns:r="http://schemas.openxmlformats.org/officeDocument/2006/relationships" xmlns:m="http://schemas.openxmlformats.org/officeDocument/2006/math" xmlns:v="urn:schemas-microsoft-com:vml" xmlns:wp14="http://schemas.microsoft.com/office/word/2010/wordprocessingDrawing" xmlns:wp="http://schemas.openxmlformats.org/drawingml/2006/wordprocessingDrawing" xmlns:w10="urn:schemas-microsoft-com:office:word" xmlns:w="http://schemas.openxmlformats.org/wordprocessingml/2006/main" xmlns:w14="http://schemas.microsoft.com/office/word/2010/wordml" xmlns:w15="http://schemas.microsoft.com/office/word/2012/wordml" xmlns:w16cex="http://schemas.microsoft.com/office/word/2018/wordml/cex" xmlns:w16cid="http://schemas.microsoft.com/office/word/2016/wordml/cid" xmlns:w16="http://schemas.microsoft.com/office/word/2018/wordml" xmlns:w16du="http://schemas.microsoft.com/office/word/2023/wordml/word16du" xmlns:w16sdtdh="http://schemas.microsoft.com/office/word/2020/wordml/sdtdatahash" xmlns:w16sdtfl="http://schemas.microsoft.com/office/word/2024/wordml/sdtformatlock" xmlns:w16se="http://schemas.microsoft.com/office/word/2015/wordml/symex" xmlns:wpg="http://schemas.microsoft.com/office/word/2010/wordprocessingGroup" xmlns:wpi="http://schemas.microsoft.com/office/word/2010/wordprocessingInk" xmlns:wne="http://schemas.microsoft.com/office/word/2006/wordml" xmlns:wps="http://schemas.microsoft.com/office/word/2010/wordprocessingShape" mc:Ignorable="w14 w15 w16se w16cid w16 w16cex w16sdtdh w16sdtfl w16du wp14">
   <w:body>
+    <w:p>
+      <w:pPr>
+        <w:spacing w:after="20"/>
+        <w:jc w:val="center"/>
+        <w:rPr>
+          <w:b/>
+          <w:color w:val="1F4E79"/>
+          <w:sz w:val="32"/>
+        </w:rPr>
+      </w:pPr>
+    </w:p>
     <w:p>
       <w:pPr>
         <w:spacing w:after="20"/>
@@ -20,13 +31,69 @@
       <w:pPr>
         <w:spacing w:after="60"/>
         <w:jc w:val="center"/>
+        <w:rPr>
+          <w:color w:val="464646"/>
+          <w:sz w:val="16"/>
+        </w:rPr>
       </w:pPr>
       <w:r>
         <w:rPr>
           <w:color w:val="464646"/>
           <w:sz w:val="16"/>
         </w:rPr>
-        <w:t>lazic.andrija223@gmail.com | linkedin.com/in/andrija-lazic-dev | github.com/AndrijaLazic | Kragujevac, Serbia</w:t>
+        <w:t xml:space="preserve">lazic.andrija223@gmail.com | </w:t>
+      </w:r>
+      <w:hyperlink r:id="rId6" w:history="1">
+        <w:r>
+          <w:rPr>
+            <w:rStyle w:val="Hyperlink"/>
+            <w:sz w:val="16"/>
+          </w:rPr>
+          <w:t>linkedin.com/in/andrija-lazic-dev</w:t>
+        </w:r>
+      </w:hyperlink>
+      <w:r>
+        <w:rPr>
+          <w:color w:val="464646"/>
+          <w:sz w:val="16"/>
+        </w:rPr>
+        <w:t xml:space="preserve"> | </w:t>
+      </w:r>
+      <w:hyperlink r:id="rId7" w:history="1">
+        <w:r>
+          <w:rPr>
+            <w:rStyle w:val="Hyperlink"/>
+            <w:sz w:val="16"/>
+          </w:rPr>
+          <w:t>github.com/AndrijaLazic</w:t>
+        </w:r>
+      </w:hyperlink>
+    </w:p>
+    <w:p>
+      <w:pPr>
+        <w:spacing w:after="60"/>
+        <w:jc w:val="center"/>
+      </w:pPr>
+      <w:r>
+        <w:rPr>
+          <w:color w:val="464646"/>
+          <w:sz w:val="16"/>
+        </w:rPr>
+        <w:t>Kragujevac, Serbia</w:t>
+      </w:r>
+      <w:r>
+        <w:rPr>
+          <w:color w:val="464646"/>
+          <w:sz w:val="16"/>
+        </w:rPr>
+        <w:t xml:space="preserve"> | </w:t>
+      </w:r>
+      <w:r>
+        <w:rPr>
+          <w:color w:val="464646"/>
+          <w:sz w:val="16"/>
+        </w:rPr>
+        <w:t>+381615561004</w:t>
       </w:r>
     </w:p>
     <w:p>
@@ -54,64 +121,106 @@
       </w:pPr>
       <w:r>
         <w:rPr>
+          <w:rFonts w:ascii="Calibri" w:hAnsi="Calibri"/>
           <w:b/>
-          <w:color w:val="000000"/>
+          <w:sz w:val="20"/>
         </w:rPr>
-        <w:t>AI / Machine Learning Engineer</w:t>
+        <w:t>DevOps Engineer</w:t>
       </w:r>
       <w:r>
         <w:rPr>
-          <w:color w:val="505050"/>
+          <w:rFonts w:ascii="Calibri" w:hAnsi="Calibri"/>
+          <w:sz w:val="20"/>
         </w:rPr>
         <w:tab/>
         <w:t>May 2025 - Present</w:t>
       </w:r>
     </w:p>
     <w:p>
+      <w:pPr>
+        <w:spacing w:after="120"/>
+      </w:pPr>
       <w:r>
         <w:rPr>
+          <w:rFonts w:ascii="Calibri" w:hAnsi="Calibri"/>
           <w:i/>
-          <w:color w:val="505050"/>
         </w:rPr>
         <w:t>DigitalLeather | Kragujevac</w:t>
       </w:r>
     </w:p>
     <w:p>
+      <w:pPr>
+        <w:contextualSpacing/>
+      </w:pPr>
       <w:r>
         <w:rPr>
-          <w:color w:val="000000"/>
-          <w:sz w:val="17"/>
+          <w:rFonts w:ascii="Calibri" w:hAnsi="Calibri"/>
         </w:rPr>
-        <w:t>Worked on FMEA Excellence, a SaaS application that uses AI and machine learning to support risk evaluation and ROI-based decision-making.</w:t>
+        <w:t>Responsible for infrastructure, deployment automation, and production reliability across VPS and on-premises deployment environments.</w:t>
       </w:r>
     </w:p>
     <w:p>
       <w:pPr>
         <w:ind w:left="230" w:hanging="173"/>
+        <w:contextualSpacing/>
       </w:pPr>
       <w:r>
         <w:rPr>
-          <w:color w:val="000000"/>
-          <w:sz w:val="17"/>
+          <w:rFonts w:ascii="Calibri" w:hAnsi="Calibri"/>
         </w:rPr>
-        <w:t>• Implemented an algorithm for time-series forecasting that selects the best model for each scenario and uses real-time data.</w:t>
+        <w:t>• Designed and set up the full infrastructure from scratch for VPS and on-premises deployments.</w:t>
       </w:r>
     </w:p>
     <w:p>
       <w:pPr>
         <w:ind w:left="230" w:hanging="173"/>
+        <w:contextualSpacing/>
       </w:pPr>
       <w:r>
         <w:rPr>
-          <w:color w:val="000000"/>
-          <w:sz w:val="17"/>
+          <w:rFonts w:ascii="Calibri" w:hAnsi="Calibri"/>
         </w:rPr>
-        <w:t>• Developed machine learning workflows for predicting costs, risk impact, and action-plan value.</w:t>
+        <w:t>• Containerized services using Docker and Docker Compose across development, demo, and production environments.</w:t>
       </w:r>
     </w:p>
     <w:p>
       <w:pPr>
-        <w:spacing w:after="20"/>
+        <w:ind w:left="230" w:hanging="173"/>
+        <w:contextualSpacing/>
+      </w:pPr>
+      <w:r>
+        <w:rPr>
+          <w:rFonts w:ascii="Calibri" w:hAnsi="Calibri"/>
+        </w:rPr>
+        <w:t>• Built and maintained CI/CD pipelines with GitHub Actions, automating the full build and deployment lifecycle.</w:t>
+      </w:r>
+    </w:p>
+    <w:p>
+      <w:pPr>
+        <w:ind w:left="230" w:hanging="173"/>
+        <w:contextualSpacing/>
+      </w:pPr>
+      <w:r>
+        <w:rPr>
+          <w:rFonts w:ascii="Calibri" w:hAnsi="Calibri"/>
+        </w:rPr>
+        <w:t>• Configured Nginx, SSL/TLS, firewall rules, and security hardening across the stack.</w:t>
+      </w:r>
+    </w:p>
+    <w:p>
+      <w:pPr>
+        <w:ind w:left="230" w:hanging="173"/>
+        <w:contextualSpacing/>
+      </w:pPr>
+      <w:r>
+        <w:rPr>
+          <w:rFonts w:ascii="Calibri" w:hAnsi="Calibri"/>
+        </w:rPr>
+        <w:t>• Set up monitoring and logging for system health visibility and faster incident response.</w:t>
+      </w:r>
+    </w:p>
+    <w:p>
+      <w:pPr>
         <w:rPr>
           <w:color w:val="000000"/>
           <w:sz w:val="17"/>
@@ -119,40 +228,17 @@
       </w:pPr>
       <w:r>
         <w:rPr>
+          <w:rFonts w:ascii="Calibri" w:hAnsi="Calibri"/>
           <w:b/>
-          <w:color w:val="000000"/>
-          <w:sz w:val="17"/>
         </w:rPr>
         <w:t xml:space="preserve">Technologies: </w:t>
       </w:r>
       <w:r>
         <w:rPr>
-          <w:color w:val="000000"/>
-          <w:sz w:val="17"/>
+          <w:rFonts w:ascii="Calibri" w:hAnsi="Calibri"/>
         </w:rPr>
-        <w:t xml:space="preserve">Python, </w:t>
+        <w:t>Docker, Docker Compose, GitHub Actions, Nginx, Linux, VPS, SSL/TLS, CI/CD</w:t>
       </w:r>
-      <w:proofErr w:type="spellStart"/>
-      <w:r>
-        <w:rPr>
-          <w:color w:val="000000"/>
-          <w:sz w:val="17"/>
-        </w:rPr>
-        <w:t>FastAPI</w:t>
-      </w:r>
-      <w:proofErr w:type="spellEnd"/>
-      <w:r>
-        <w:rPr>
-          <w:color w:val="000000"/>
-          <w:sz w:val="17"/>
-        </w:rPr>
-        <w:t>, Scikit-learn</w:t>
-      </w:r>
-    </w:p>
-    <w:p>
-      <w:pPr>
-        <w:spacing w:after="20"/>
-      </w:pPr>
     </w:p>
     <w:p>
       <w:pPr>
@@ -163,57 +249,120 @@
       </w:pPr>
       <w:r>
         <w:rPr>
+          <w:rFonts w:ascii="Calibri" w:hAnsi="Calibri"/>
           <w:b/>
-          <w:color w:val="000000"/>
+          <w:sz w:val="20"/>
         </w:rPr>
-        <w:t>Backend Software Engineer</w:t>
+        <w:br/>
       </w:r>
       <w:r>
         <w:rPr>
-          <w:color w:val="505050"/>
+          <w:rFonts w:ascii="Calibri" w:hAnsi="Calibri"/>
+          <w:b/>
+          <w:sz w:val="20"/>
+        </w:rPr>
+        <w:t>Software Engineer</w:t>
+      </w:r>
+      <w:r>
+        <w:rPr>
+          <w:rFonts w:ascii="Calibri" w:hAnsi="Calibri"/>
+          <w:sz w:val="20"/>
         </w:rPr>
         <w:tab/>
-        <w:t>May 2025 - Present</w:t>
+        <w:t>Nov 2024 - Jun 2026</w:t>
       </w:r>
     </w:p>
     <w:p>
+      <w:pPr>
+        <w:spacing w:after="120"/>
+      </w:pPr>
       <w:r>
         <w:rPr>
+          <w:rFonts w:ascii="Calibri" w:hAnsi="Calibri"/>
           <w:i/>
-          <w:color w:val="505050"/>
         </w:rPr>
         <w:t>DigitalLeather | Kragujevac</w:t>
       </w:r>
     </w:p>
     <w:p>
+      <w:pPr>
+        <w:contextualSpacing/>
+      </w:pPr>
       <w:r>
         <w:rPr>
-          <w:color w:val="000000"/>
-          <w:sz w:val="17"/>
+          <w:rFonts w:ascii="Calibri" w:hAnsi="Calibri"/>
         </w:rPr>
-        <w:t>Worked on FMEA Traditional, a SaaS application for industries where FMEA is part of the quality management standard.</w:t>
+        <w:t>Worked on FMEA Excellence, a real-time risk management platform based on the FMEA methodology for automotive industry use cases.</w:t>
       </w:r>
     </w:p>
     <w:p>
       <w:pPr>
         <w:ind w:left="230" w:hanging="173"/>
+        <w:contextualSpacing/>
       </w:pPr>
       <w:r>
         <w:rPr>
-          <w:color w:val="000000"/>
-          <w:sz w:val="17"/>
+          <w:rFonts w:ascii="Calibri" w:hAnsi="Calibri"/>
         </w:rPr>
-        <w:t>• Developed backend features and automated deployment processes for cloud/VPS environments.</w:t>
+        <w:t>• Took ownership of backend architecture in a small team and led development of the core services in Python.</w:t>
       </w:r>
     </w:p>
     <w:p>
       <w:pPr>
         <w:ind w:left="230" w:hanging="173"/>
+        <w:contextualSpacing/>
       </w:pPr>
       <w:r>
         <w:rPr>
-          <w:color w:val="000000"/>
-          <w:sz w:val="17"/>
+          <w:rFonts w:ascii="Calibri" w:hAnsi="Calibri"/>
+        </w:rPr>
+        <w:t>• Developed backend features for user file import/export workflows, including exports into custom templates.</w:t>
+      </w:r>
+    </w:p>
+    <w:p>
+      <w:pPr>
+        <w:ind w:left="230" w:hanging="173"/>
+        <w:contextualSpacing/>
+      </w:pPr>
+      <w:r>
+        <w:rPr>
+          <w:rFonts w:ascii="Calibri" w:hAnsi="Calibri"/>
+        </w:rPr>
+        <w:t>• Designed AI-powered modules for predicting future risk costs using historical data, real-time data, and user-defined parameters.</w:t>
+      </w:r>
+    </w:p>
+    <w:p>
+      <w:pPr>
+        <w:ind w:left="230" w:hanging="173"/>
+        <w:contextualSpacing/>
+      </w:pPr>
+      <w:r>
+        <w:rPr>
+          <w:rFonts w:ascii="Calibri" w:hAnsi="Calibri"/>
+        </w:rPr>
+        <w:t>• Built machine learning workflows for forecasting costs, risk impact, and action-plan value.</w:t>
+      </w:r>
+    </w:p>
+    <w:p>
+      <w:pPr>
+        <w:ind w:left="230" w:hanging="173"/>
+        <w:contextualSpacing/>
+      </w:pPr>
+      <w:r>
+        <w:rPr>
+          <w:rFonts w:ascii="Calibri" w:hAnsi="Calibri"/>
+        </w:rPr>
+        <w:t>• Built an optimization engine that analyzes risk action combinations and recommends the most effective option based on user goals.</w:t>
+      </w:r>
+    </w:p>
+    <w:p>
+      <w:pPr>
+        <w:ind w:left="230" w:hanging="173"/>
+        <w:contextualSpacing/>
+      </w:pPr>
+      <w:r>
+        <w:rPr>
+          <w:rFonts w:ascii="Calibri" w:hAnsi="Calibri"/>
         </w:rPr>
         <w:t>• Implemented AI-assisted translation features for easier use of documentation in foreign languages.</w:t>
       </w:r>
@@ -221,30 +370,32 @@
     <w:p>
       <w:pPr>
         <w:ind w:left="230" w:hanging="173"/>
+        <w:contextualSpacing/>
       </w:pPr>
       <w:r>
         <w:rPr>
-          <w:color w:val="000000"/>
-          <w:sz w:val="17"/>
+          <w:rFonts w:ascii="Calibri" w:hAnsi="Calibri"/>
         </w:rPr>
-        <w:t>• Built file export functionality that allows users to export application data into custom templates.</w:t>
+        <w:t xml:space="preserve">• Independently created the FMEA Excellence product website, including the public product page at </w:t>
+      </w:r>
+      <w:hyperlink r:id="rId8" w:history="1">
+        <w:r>
+          <w:rPr>
+            <w:rStyle w:val="Hyperlink"/>
+            <w:rFonts w:ascii="Calibri" w:hAnsi="Calibri"/>
+          </w:rPr>
+          <w:t>fmea-excellence.com</w:t>
+        </w:r>
+      </w:hyperlink>
+      <w:r>
+        <w:rPr>
+          <w:rFonts w:ascii="Calibri" w:hAnsi="Calibri"/>
+        </w:rPr>
+        <w:t>.</w:t>
       </w:r>
     </w:p>
     <w:p>
       <w:pPr>
-        <w:ind w:left="230" w:hanging="173"/>
-      </w:pPr>
-      <w:r>
-        <w:rPr>
-          <w:color w:val="000000"/>
-          <w:sz w:val="17"/>
-        </w:rPr>
-        <w:t>• Created deployment orchestration using GitHub Actions and Docker.</w:t>
-      </w:r>
-    </w:p>
-    <w:p>
-      <w:pPr>
-        <w:spacing w:after="20"/>
         <w:rPr>
           <w:color w:val="000000"/>
           <w:sz w:val="17"/>
@@ -252,18 +403,16 @@
       </w:pPr>
       <w:r>
         <w:rPr>
+          <w:rFonts w:ascii="Calibri" w:hAnsi="Calibri"/>
           <w:b/>
-          <w:color w:val="000000"/>
-          <w:sz w:val="17"/>
         </w:rPr>
         <w:t xml:space="preserve">Technologies: </w:t>
       </w:r>
       <w:r>
         <w:rPr>
-          <w:color w:val="000000"/>
-          <w:sz w:val="17"/>
+          <w:rFonts w:ascii="Calibri" w:hAnsi="Calibri"/>
         </w:rPr>
-        <w:t>Spring Boot, Docker, MySQL, GitHub Actions</w:t>
+        <w:t>Python, FastAPI, Scikit-learn, Spring Boot, MySQL, Docker</w:t>
       </w:r>
     </w:p>
     <w:p>
@@ -294,6 +443,9 @@
       </w:r>
     </w:p>
     <w:p>
+      <w:pPr>
+        <w:spacing w:after="120"/>
+      </w:pPr>
       <w:r>
         <w:rPr>
           <w:i/>
@@ -337,7 +489,6 @@
     </w:p>
     <w:p>
       <w:pPr>
-        <w:spacing w:after="20"/>
         <w:rPr>
           <w:color w:val="000000"/>
           <w:sz w:val="17"/>
@@ -356,23 +507,7 @@
           <w:color w:val="000000"/>
           <w:sz w:val="17"/>
         </w:rPr>
-        <w:t xml:space="preserve">Spring Boot, Docker, MySQL, </w:t>
-      </w:r>
-      <w:proofErr w:type="spellStart"/>
-      <w:r>
-        <w:rPr>
-          <w:color w:val="000000"/>
-          <w:sz w:val="17"/>
-        </w:rPr>
-        <w:t>Keycloak</w:t>
-      </w:r>
-      <w:proofErr w:type="spellEnd"/>
-      <w:r>
-        <w:rPr>
-          <w:color w:val="000000"/>
-          <w:sz w:val="17"/>
-        </w:rPr>
-        <w:t>, RabbitMQ</w:t>
+        <w:t>Spring Boot, Docker, MySQL, Keycloak, RabbitMQ</w:t>
       </w:r>
     </w:p>
     <w:p>
@@ -429,9 +564,6 @@
       </w:r>
     </w:p>
     <w:p>
-      <w:pPr>
-        <w:spacing w:after="20"/>
-      </w:pPr>
       <w:r>
         <w:rPr>
           <w:b/>
@@ -446,71 +578,6 @@
           <w:sz w:val="17"/>
         </w:rPr>
         <w:t>Python, Node.js, React, MongoDB</w:t>
-      </w:r>
-    </w:p>
-    <w:p>
-      <w:pPr>
-        <w:tabs>
-          <w:tab w:val="right" w:pos="10224"/>
-        </w:tabs>
-        <w:spacing w:before="40"/>
-      </w:pPr>
-      <w:r>
-        <w:rPr>
-          <w:b/>
-          <w:color w:val="000000"/>
-        </w:rPr>
-        <w:t>AI Playground</w:t>
-      </w:r>
-      <w:r>
-        <w:rPr>
-          <w:color w:val="505050"/>
-          <w:sz w:val="17"/>
-        </w:rPr>
-        <w:tab/>
-        <w:t>Feb 2022 - Jun 2022</w:t>
-      </w:r>
-    </w:p>
-    <w:p>
-      <w:r>
-        <w:rPr>
-          <w:color w:val="000000"/>
-          <w:sz w:val="17"/>
-        </w:rPr>
-        <w:t>Web application for data processing and machine learning model training.</w:t>
-      </w:r>
-    </w:p>
-    <w:p>
-      <w:r>
-        <w:rPr>
-          <w:color w:val="000000"/>
-          <w:sz w:val="17"/>
-        </w:rPr>
-        <w:t>Served as team lead, prepared the Software Design Specification, assigned tasks, and contributed to development.</w:t>
-      </w:r>
-    </w:p>
-    <w:p>
-      <w:pPr>
-        <w:spacing w:after="20"/>
-        <w:rPr>
-          <w:color w:val="000000"/>
-          <w:sz w:val="17"/>
-        </w:rPr>
-      </w:pPr>
-      <w:r>
-        <w:rPr>
-          <w:b/>
-          <w:color w:val="000000"/>
-          <w:sz w:val="17"/>
-        </w:rPr>
-        <w:t xml:space="preserve">Technologies: </w:t>
-      </w:r>
-      <w:r>
-        <w:rPr>
-          <w:color w:val="000000"/>
-          <w:sz w:val="17"/>
-        </w:rPr>
-        <w:t>.NET, MySQL, Python, TensorFlow, Angular</w:t>
       </w:r>
     </w:p>
     <w:p>
@@ -596,18 +663,16 @@
     <w:p>
       <w:r>
         <w:rPr>
+          <w:rFonts w:ascii="Calibri" w:hAnsi="Calibri"/>
           <w:b/>
-          <w:color w:val="000000"/>
-          <w:sz w:val="17"/>
         </w:rPr>
         <w:t xml:space="preserve">Programming: </w:t>
       </w:r>
       <w:r>
         <w:rPr>
-          <w:color w:val="000000"/>
-          <w:sz w:val="17"/>
+          <w:rFonts w:ascii="Calibri" w:hAnsi="Calibri"/>
         </w:rPr>
-        <w:t>Python, Java, Spring Boot, Node.js, React, Angular, .NET, PHP, SQL, Kotlin, C, Selenium</w:t>
+        <w:t>Python, Java, Spring Boot, FastAPI, Node.js, React, Angular, .NET, PHP, SQL, Kotlin, C, Selenium</w:t>
       </w:r>
     </w:p>
     <w:p>
@@ -618,30 +683,18 @@
           <w:sz w:val="17"/>
         </w:rPr>
       </w:pPr>
-      <w:proofErr w:type="gramStart"/>
       <w:r>
         <w:rPr>
+          <w:rFonts w:ascii="Calibri" w:hAnsi="Calibri"/>
           <w:b/>
-          <w:color w:val="000000"/>
-          <w:sz w:val="17"/>
         </w:rPr>
-        <w:t>Other</w:t>
-      </w:r>
-      <w:proofErr w:type="gramEnd"/>
-      <w:r>
-        <w:rPr>
-          <w:b/>
-          <w:color w:val="000000"/>
-          <w:sz w:val="17"/>
-        </w:rPr>
-        <w:t xml:space="preserve">: </w:t>
+        <w:t xml:space="preserve">Other: </w:t>
       </w:r>
       <w:r>
         <w:rPr>
-          <w:color w:val="000000"/>
-          <w:sz w:val="17"/>
+          <w:rFonts w:ascii="Calibri" w:hAnsi="Calibri"/>
         </w:rPr>
-        <w:t>Docker, Git, GitHub Actions, Linux, REST APIs, Microsoft Office</w:t>
+        <w:t>Docker, Docker Compose, GitHub Actions, Linux, Nginx, CI/CD, VPS, REST APIs, Microsoft Office</w:t>
       </w:r>
     </w:p>
     <w:p>
@@ -727,7 +780,7 @@
     </w:p>
     <w:sectPr>
       <w:pgSz w:w="12240" w:h="15840"/>
-      <w:pgMar w:top="547" w:right="691" w:bottom="547" w:left="691" w:header="720" w:footer="720" w:gutter="0"/>
+      <w:pgMar w:top="560" w:right="720" w:bottom="560" w:left="720" w:header="720" w:footer="720" w:gutter="0"/>
       <w:cols w:space="720"/>
       <w:docGrid w:linePitch="360"/>
     </w:sectPr>
@@ -12319,6 +12372,41 @@
       </w:tcPr>
     </w:tblStylePr>
   </w:style>
+  <w:style w:type="character" w:styleId="Hyperlink">
+    <w:name w:val="Hyperlink"/>
+    <w:basedOn w:val="DefaultParagraphFont"/>
+    <w:uiPriority w:val="99"/>
+    <w:unhideWhenUsed/>
+    <w:rsid w:val="00B0055A"/>
+    <w:rPr>
+      <w:color w:val="0000FF" w:themeColor="hyperlink"/>
+      <w:u w:val="single"/>
+    </w:rPr>
+  </w:style>
+  <w:style w:type="character" w:styleId="UnresolvedMention">
+    <w:name w:val="Unresolved Mention"/>
+    <w:basedOn w:val="DefaultParagraphFont"/>
+    <w:uiPriority w:val="99"/>
+    <w:semiHidden/>
+    <w:unhideWhenUsed/>
+    <w:rsid w:val="00B0055A"/>
+    <w:rPr>
+      <w:color w:val="605E5C"/>
+      <w:shd w:val="clear" w:color="auto" w:fill="E1DFDD"/>
+    </w:rPr>
+  </w:style>
+  <w:style w:type="character" w:styleId="FollowedHyperlink">
+    <w:name w:val="FollowedHyperlink"/>
+    <w:basedOn w:val="DefaultParagraphFont"/>
+    <w:uiPriority w:val="99"/>
+    <w:semiHidden/>
+    <w:unhideWhenUsed/>
+    <w:rsid w:val="00B0055A"/>
+    <w:rPr>
+      <w:color w:val="800080" w:themeColor="followedHyperlink"/>
+      <w:u w:val="single"/>
+    </w:rPr>
+  </w:style>
 </w:styles>
 </file>
 

</xml_diff>